<commit_message>
added updated draft and summary file
</commit_message>
<xml_diff>
--- a/4_drafts/Draft6/Martyn_etal_Draft6.docx
+++ b/4_drafts/Draft6/Martyn_etal_Draft6.docx
@@ -9293,7 +9293,6 @@
           <w:bCs/>
         </w:rPr>
       </w:pPr>
-      <w:commentRangeStart w:id="1"/>
       <w:r>
         <w:rPr>
           <w:rFonts w:ascii="Times New Roman" w:hAnsi="Times New Roman" w:cs="Times New Roman"/>
@@ -9333,13 +9332,6 @@
           <w:bCs/>
         </w:rPr>
         <w:t>compositions</w:t>
-      </w:r>
-      <w:commentRangeEnd w:id="1"/>
-      <w:r>
-        <w:rPr>
-          <w:rStyle w:val="CommentReference"/>
-        </w:rPr>
-        <w:commentReference w:id="1"/>
       </w:r>
     </w:p>
     <w:p>
@@ -9595,7 +9587,19 @@
         <w:rPr>
           <w:rFonts w:ascii="Times New Roman" w:hAnsi="Times New Roman" w:cs="Times New Roman"/>
         </w:rPr>
-        <w:t>, which together accounted for 10-45% of total relative abundance (</w:t>
+        <w:t>, which together accounted for 1-</w:t>
+      </w:r>
+      <w:r>
+        <w:rPr>
+          <w:rFonts w:ascii="Times New Roman" w:hAnsi="Times New Roman" w:cs="Times New Roman"/>
+        </w:rPr>
+        <w:t>12</w:t>
+      </w:r>
+      <w:r>
+        <w:rPr>
+          <w:rFonts w:ascii="Times New Roman" w:hAnsi="Times New Roman" w:cs="Times New Roman"/>
+        </w:rPr>
+        <w:t>% of total relative abundance (</w:t>
       </w:r>
       <w:r>
         <w:rPr>
@@ -9671,143 +9675,13 @@
         <w:rPr>
           <w:rFonts w:ascii="Times New Roman" w:hAnsi="Times New Roman" w:cs="Times New Roman"/>
         </w:rPr>
-        <w:t>86-</w:t>
-      </w:r>
-      <w:r>
-        <w:rPr>
-          <w:rFonts w:ascii="Times New Roman" w:hAnsi="Times New Roman" w:cs="Times New Roman"/>
-        </w:rPr>
-        <w:t xml:space="preserve">90% using rhizosphere data and </w:t>
-      </w:r>
-      <w:r>
-        <w:rPr>
-          <w:rFonts w:ascii="Times New Roman" w:hAnsi="Times New Roman" w:cs="Times New Roman"/>
-        </w:rPr>
-        <w:t>93-</w:t>
-      </w:r>
-      <w:r>
-        <w:rPr>
-          <w:rFonts w:ascii="Times New Roman" w:hAnsi="Times New Roman" w:cs="Times New Roman"/>
-        </w:rPr>
-        <w:t>96% using root microbiome data</w:t>
-      </w:r>
-      <w:r>
-        <w:rPr>
-          <w:rFonts w:ascii="Times New Roman" w:hAnsi="Times New Roman" w:cs="Times New Roman"/>
-        </w:rPr>
-        <w:t xml:space="preserve">, </w:t>
-      </w:r>
-      <w:commentRangeStart w:id="2"/>
-      <w:r>
-        <w:rPr>
-          <w:rFonts w:ascii="Times New Roman" w:hAnsi="Times New Roman" w:cs="Times New Roman"/>
-        </w:rPr>
-        <w:t xml:space="preserve">with only </w:t>
-      </w:r>
-      <w:r>
-        <w:rPr>
-          <w:rFonts w:ascii="Times New Roman" w:hAnsi="Times New Roman" w:cs="Times New Roman"/>
-          <w:highlight w:val="red"/>
-        </w:rPr>
-        <w:t>XXX</w:t>
-      </w:r>
-      <w:r>
-        <w:rPr>
-          <w:rFonts w:ascii="Times New Roman" w:hAnsi="Times New Roman" w:cs="Times New Roman"/>
-        </w:rPr>
-        <w:t xml:space="preserve"> out of </w:t>
-      </w:r>
-      <w:r>
-        <w:rPr>
-          <w:rFonts w:ascii="Times New Roman" w:hAnsi="Times New Roman" w:cs="Times New Roman"/>
-          <w:highlight w:val="red"/>
-        </w:rPr>
-        <w:t>XXX</w:t>
-      </w:r>
-      <w:r>
-        <w:rPr>
-          <w:rFonts w:ascii="Times New Roman" w:hAnsi="Times New Roman" w:cs="Times New Roman"/>
-        </w:rPr>
-        <w:t xml:space="preserve"> samples </w:t>
-      </w:r>
-      <w:commentRangeEnd w:id="2"/>
-      <w:r>
-        <w:rPr>
-          <w:rStyle w:val="CommentReference"/>
-        </w:rPr>
-        <w:commentReference w:id="2"/>
-      </w:r>
-      <w:r>
-        <w:rPr>
-          <w:rFonts w:ascii="Times New Roman" w:hAnsi="Times New Roman" w:cs="Times New Roman"/>
-        </w:rPr>
-        <w:t xml:space="preserve">being </w:t>
-      </w:r>
-      <w:r>
-        <w:rPr>
-          <w:rFonts w:ascii="Times New Roman" w:hAnsi="Times New Roman" w:cs="Times New Roman"/>
-        </w:rPr>
-        <w:t>misclassified</w:t>
-      </w:r>
-      <w:r>
-        <w:rPr>
-          <w:rFonts w:ascii="Times New Roman" w:hAnsi="Times New Roman" w:cs="Times New Roman"/>
-        </w:rPr>
-        <w:t xml:space="preserve"> (</w:t>
-      </w:r>
-      <w:r>
-        <w:rPr>
-          <w:rFonts w:ascii="Times New Roman" w:hAnsi="Times New Roman" w:cs="Times New Roman"/>
-          <w:highlight w:val="magenta"/>
-        </w:rPr>
-        <w:t>Fig. 3</w:t>
-      </w:r>
-      <w:proofErr w:type="gramStart"/>
-      <w:r>
-        <w:rPr>
-          <w:rFonts w:ascii="Times New Roman" w:hAnsi="Times New Roman" w:cs="Times New Roman"/>
-          <w:highlight w:val="magenta"/>
-        </w:rPr>
-        <w:t>B,</w:t>
-      </w:r>
-      <w:r>
-        <w:rPr>
-          <w:rFonts w:ascii="Times New Roman" w:hAnsi="Times New Roman" w:cs="Times New Roman"/>
-          <w:highlight w:val="magenta"/>
-        </w:rPr>
-        <w:t>C</w:t>
-      </w:r>
-      <w:proofErr w:type="gramEnd"/>
-      <w:r>
-        <w:rPr>
-          <w:rFonts w:ascii="Times New Roman" w:hAnsi="Times New Roman" w:cs="Times New Roman"/>
-        </w:rPr>
-        <w:t>)</w:t>
-      </w:r>
-      <w:r>
-        <w:rPr>
-          <w:rFonts w:ascii="Times New Roman" w:hAnsi="Times New Roman" w:cs="Times New Roman"/>
-        </w:rPr>
-        <w:t>.</w:t>
-      </w:r>
-      <w:r>
-        <w:rPr>
-          <w:rFonts w:ascii="Times New Roman" w:hAnsi="Times New Roman" w:cs="Times New Roman"/>
-        </w:rPr>
-        <w:t xml:space="preserve"> </w:t>
-      </w:r>
-      <w:commentRangeStart w:id="3"/>
-      <w:r>
-        <w:rPr>
-          <w:rFonts w:ascii="Times New Roman" w:hAnsi="Times New Roman" w:cs="Times New Roman"/>
-        </w:rPr>
-        <w:t>For</w:t>
-      </w:r>
-      <w:r>
-        <w:rPr>
-          <w:rFonts w:ascii="Times New Roman" w:hAnsi="Times New Roman" w:cs="Times New Roman"/>
-        </w:rPr>
-        <w:t xml:space="preserve"> </w:t>
+        <w:t>93.3</w:t>
+      </w:r>
+      <w:r>
+        <w:rPr>
+          <w:rFonts w:ascii="Times New Roman" w:hAnsi="Times New Roman" w:cs="Times New Roman"/>
+        </w:rPr>
+        <w:t xml:space="preserve">% using </w:t>
       </w:r>
       <w:r>
         <w:rPr>
@@ -9821,29 +9695,146 @@
         <w:rPr>
           <w:rFonts w:ascii="Times New Roman" w:hAnsi="Times New Roman" w:cs="Times New Roman"/>
         </w:rPr>
-        <w:t xml:space="preserve">, </w:t>
-      </w:r>
-      <w:r>
-        <w:rPr>
-          <w:rFonts w:ascii="Times New Roman" w:hAnsi="Times New Roman" w:cs="Times New Roman"/>
-        </w:rPr>
-        <w:t xml:space="preserve">the most influential ASVs belonged to </w:t>
-      </w:r>
-      <w:proofErr w:type="spellStart"/>
+        <w:t xml:space="preserve"> and 80-83.3% using </w:t>
+      </w:r>
       <w:r>
         <w:rPr>
           <w:rFonts w:ascii="Times New Roman" w:hAnsi="Times New Roman" w:cs="Times New Roman"/>
           <w:i/>
           <w:iCs/>
         </w:rPr>
-        <w:t>Burkholderiales</w:t>
-      </w:r>
-      <w:proofErr w:type="spellEnd"/>
+        <w:t>Hordeum</w:t>
+      </w:r>
+      <w:r>
+        <w:rPr>
+          <w:rFonts w:ascii="Times New Roman" w:hAnsi="Times New Roman" w:cs="Times New Roman"/>
+        </w:rPr>
+        <w:t xml:space="preserve"> </w:t>
+      </w:r>
+      <w:r>
+        <w:rPr>
+          <w:rFonts w:ascii="Times New Roman" w:hAnsi="Times New Roman" w:cs="Times New Roman"/>
+        </w:rPr>
+        <w:t xml:space="preserve">rhizosphere </w:t>
+      </w:r>
+      <w:r>
+        <w:rPr>
+          <w:rFonts w:ascii="Times New Roman" w:hAnsi="Times New Roman" w:cs="Times New Roman"/>
+        </w:rPr>
+        <w:t xml:space="preserve">and </w:t>
+      </w:r>
+      <w:r>
+        <w:rPr>
+          <w:rFonts w:ascii="Times New Roman" w:hAnsi="Times New Roman" w:cs="Times New Roman"/>
+        </w:rPr>
+        <w:t>root microbiome data</w:t>
+      </w:r>
+      <w:r>
+        <w:rPr>
+          <w:rFonts w:ascii="Times New Roman" w:hAnsi="Times New Roman" w:cs="Times New Roman"/>
+        </w:rPr>
+        <w:t xml:space="preserve">, with only </w:t>
+      </w:r>
+      <w:r>
+        <w:rPr>
+          <w:rFonts w:ascii="Times New Roman" w:hAnsi="Times New Roman" w:cs="Times New Roman"/>
+        </w:rPr>
+        <w:t>15</w:t>
+      </w:r>
+      <w:r>
+        <w:rPr>
+          <w:rFonts w:ascii="Times New Roman" w:hAnsi="Times New Roman" w:cs="Times New Roman"/>
+        </w:rPr>
+        <w:t xml:space="preserve"> out o</w:t>
+      </w:r>
+      <w:r>
+        <w:rPr>
+          <w:rFonts w:ascii="Times New Roman" w:hAnsi="Times New Roman" w:cs="Times New Roman"/>
+        </w:rPr>
+        <w:t>f 120</w:t>
+      </w:r>
+      <w:r>
+        <w:rPr>
+          <w:rFonts w:ascii="Times New Roman" w:hAnsi="Times New Roman" w:cs="Times New Roman"/>
+        </w:rPr>
+        <w:t xml:space="preserve"> samples </w:t>
+      </w:r>
+      <w:r>
+        <w:rPr>
+          <w:rFonts w:ascii="Times New Roman" w:hAnsi="Times New Roman" w:cs="Times New Roman"/>
+        </w:rPr>
+        <w:t xml:space="preserve">not previously seen by the model </w:t>
+      </w:r>
+      <w:r>
+        <w:rPr>
+          <w:rFonts w:ascii="Times New Roman" w:hAnsi="Times New Roman" w:cs="Times New Roman"/>
+        </w:rPr>
+        <w:t xml:space="preserve">being </w:t>
+      </w:r>
+      <w:r>
+        <w:rPr>
+          <w:rFonts w:ascii="Times New Roman" w:hAnsi="Times New Roman" w:cs="Times New Roman"/>
+        </w:rPr>
+        <w:t>misclassified</w:t>
+      </w:r>
       <w:r>
         <w:rPr>
           <w:rFonts w:ascii="Times New Roman" w:hAnsi="Times New Roman" w:cs="Times New Roman"/>
         </w:rPr>
         <w:t xml:space="preserve"> (</w:t>
+      </w:r>
+      <w:r>
+        <w:rPr>
+          <w:rFonts w:ascii="Times New Roman" w:hAnsi="Times New Roman" w:cs="Times New Roman"/>
+          <w:highlight w:val="magenta"/>
+        </w:rPr>
+        <w:t>Fig. 3</w:t>
+      </w:r>
+      <w:proofErr w:type="gramStart"/>
+      <w:r>
+        <w:rPr>
+          <w:rFonts w:ascii="Times New Roman" w:hAnsi="Times New Roman" w:cs="Times New Roman"/>
+          <w:highlight w:val="magenta"/>
+        </w:rPr>
+        <w:t>B,</w:t>
+      </w:r>
+      <w:r>
+        <w:rPr>
+          <w:rFonts w:ascii="Times New Roman" w:hAnsi="Times New Roman" w:cs="Times New Roman"/>
+          <w:highlight w:val="magenta"/>
+        </w:rPr>
+        <w:t>C</w:t>
+      </w:r>
+      <w:proofErr w:type="gramEnd"/>
+      <w:r>
+        <w:rPr>
+          <w:rFonts w:ascii="Times New Roman" w:hAnsi="Times New Roman" w:cs="Times New Roman"/>
+        </w:rPr>
+        <w:t>)</w:t>
+      </w:r>
+      <w:r>
+        <w:rPr>
+          <w:rFonts w:ascii="Times New Roman" w:hAnsi="Times New Roman" w:cs="Times New Roman"/>
+        </w:rPr>
+        <w:t>.</w:t>
+      </w:r>
+      <w:r>
+        <w:rPr>
+          <w:rFonts w:ascii="Times New Roman" w:hAnsi="Times New Roman" w:cs="Times New Roman"/>
+        </w:rPr>
+        <w:t xml:space="preserve"> </w:t>
+      </w:r>
+      <w:r>
+        <w:rPr>
+          <w:rFonts w:ascii="Times New Roman" w:hAnsi="Times New Roman" w:cs="Times New Roman"/>
+        </w:rPr>
+        <w:t>For</w:t>
+      </w:r>
+      <w:r>
+        <w:rPr>
+          <w:rFonts w:ascii="Times New Roman" w:hAnsi="Times New Roman" w:cs="Times New Roman"/>
+        </w:rPr>
+        <w:t xml:space="preserve"> </w:t>
       </w:r>
       <w:r>
         <w:rPr>
@@ -9851,19 +9842,19 @@
           <w:i/>
           <w:iCs/>
         </w:rPr>
-        <w:t>Oxalobacteraceae</w:t>
-      </w:r>
-      <w:r>
-        <w:rPr>
-          <w:rFonts w:ascii="Times New Roman" w:hAnsi="Times New Roman" w:cs="Times New Roman"/>
-        </w:rPr>
-        <w:t>,</w:t>
-      </w:r>
-      <w:r>
-        <w:rPr>
-          <w:rFonts w:ascii="Times New Roman" w:hAnsi="Times New Roman" w:cs="Times New Roman"/>
-        </w:rPr>
-        <w:t xml:space="preserve"> </w:t>
+        <w:t>Lotus</w:t>
+      </w:r>
+      <w:r>
+        <w:rPr>
+          <w:rFonts w:ascii="Times New Roman" w:hAnsi="Times New Roman" w:cs="Times New Roman"/>
+        </w:rPr>
+        <w:t xml:space="preserve">, </w:t>
+      </w:r>
+      <w:r>
+        <w:rPr>
+          <w:rFonts w:ascii="Times New Roman" w:hAnsi="Times New Roman" w:cs="Times New Roman"/>
+        </w:rPr>
+        <w:t xml:space="preserve">influential ASVs belonged to </w:t>
       </w:r>
       <w:proofErr w:type="spellStart"/>
       <w:r>
@@ -9872,36 +9863,34 @@
           <w:i/>
           <w:iCs/>
         </w:rPr>
-        <w:t>Comamonadaceae</w:t>
+        <w:t>Burkholderiales</w:t>
       </w:r>
       <w:proofErr w:type="spellEnd"/>
       <w:r>
         <w:rPr>
           <w:rFonts w:ascii="Times New Roman" w:hAnsi="Times New Roman" w:cs="Times New Roman"/>
         </w:rPr>
-        <w:t>), along with</w:t>
-      </w:r>
-      <w:r>
-        <w:rPr>
-          <w:rFonts w:ascii="Times New Roman" w:hAnsi="Times New Roman" w:cs="Times New Roman"/>
-        </w:rPr>
-        <w:t xml:space="preserve"> </w:t>
-      </w:r>
-      <w:proofErr w:type="spellStart"/>
+        <w:t xml:space="preserve"> (</w:t>
+      </w:r>
       <w:r>
         <w:rPr>
           <w:rFonts w:ascii="Times New Roman" w:hAnsi="Times New Roman" w:cs="Times New Roman"/>
           <w:i/>
           <w:iCs/>
         </w:rPr>
-        <w:t>Pseudomonadales</w:t>
-      </w:r>
-      <w:proofErr w:type="spellEnd"/>
-      <w:r>
-        <w:rPr>
-          <w:rFonts w:ascii="Times New Roman" w:hAnsi="Times New Roman" w:cs="Times New Roman"/>
-        </w:rPr>
-        <w:t xml:space="preserve"> and </w:t>
+        <w:t>Oxalobacteraceae</w:t>
+      </w:r>
+      <w:r>
+        <w:rPr>
+          <w:rFonts w:ascii="Times New Roman" w:hAnsi="Times New Roman" w:cs="Times New Roman"/>
+        </w:rPr>
+        <w:t>,</w:t>
+      </w:r>
+      <w:r>
+        <w:rPr>
+          <w:rFonts w:ascii="Times New Roman" w:hAnsi="Times New Roman" w:cs="Times New Roman"/>
+        </w:rPr>
+        <w:t xml:space="preserve"> </w:t>
       </w:r>
       <w:proofErr w:type="spellStart"/>
       <w:r>
@@ -9910,101 +9899,36 @@
           <w:i/>
           <w:iCs/>
         </w:rPr>
-        <w:t>Rhizobiales</w:t>
+        <w:t>Comamonadaceae</w:t>
       </w:r>
       <w:proofErr w:type="spellEnd"/>
       <w:r>
         <w:rPr>
           <w:rFonts w:ascii="Times New Roman" w:hAnsi="Times New Roman" w:cs="Times New Roman"/>
         </w:rPr>
-        <w:t xml:space="preserve">, each displaying </w:t>
-      </w:r>
-      <w:r>
-        <w:rPr>
-          <w:rFonts w:ascii="Times New Roman" w:hAnsi="Times New Roman" w:cs="Times New Roman"/>
-        </w:rPr>
-        <w:t>compartment</w:t>
-      </w:r>
-      <w:r>
-        <w:rPr>
-          <w:rFonts w:ascii="Times New Roman" w:hAnsi="Times New Roman" w:cs="Times New Roman"/>
-        </w:rPr>
-        <w:t>- and soil-type-specific associations</w:t>
-      </w:r>
-      <w:r>
-        <w:rPr>
-          <w:rFonts w:ascii="Times New Roman" w:hAnsi="Times New Roman" w:cs="Times New Roman"/>
-        </w:rPr>
-        <w:t xml:space="preserve"> (</w:t>
-      </w:r>
-      <w:r>
-        <w:rPr>
-          <w:rFonts w:ascii="Times New Roman" w:hAnsi="Times New Roman" w:cs="Times New Roman"/>
-          <w:highlight w:val="magenta"/>
-        </w:rPr>
-        <w:t>Fig. 3D, Suppl. Table 2</w:t>
-      </w:r>
-      <w:r>
-        <w:rPr>
-          <w:rFonts w:ascii="Times New Roman" w:hAnsi="Times New Roman" w:cs="Times New Roman"/>
-        </w:rPr>
-        <w:t>)</w:t>
-      </w:r>
-      <w:r>
-        <w:rPr>
-          <w:rFonts w:ascii="Times New Roman" w:hAnsi="Times New Roman" w:cs="Times New Roman"/>
-        </w:rPr>
-        <w:t xml:space="preserve">. </w:t>
-      </w:r>
-      <w:r>
-        <w:rPr>
-          <w:rFonts w:ascii="Times New Roman" w:hAnsi="Times New Roman" w:cs="Times New Roman"/>
-        </w:rPr>
-        <w:t>In</w:t>
-      </w:r>
-      <w:r>
-        <w:rPr>
-          <w:rFonts w:ascii="Times New Roman" w:hAnsi="Times New Roman" w:cs="Times New Roman"/>
-        </w:rPr>
-        <w:t xml:space="preserve"> </w:t>
-      </w:r>
+        <w:t>), along with</w:t>
+      </w:r>
+      <w:r>
+        <w:rPr>
+          <w:rFonts w:ascii="Times New Roman" w:hAnsi="Times New Roman" w:cs="Times New Roman"/>
+        </w:rPr>
+        <w:t xml:space="preserve"> </w:t>
+      </w:r>
+      <w:proofErr w:type="spellStart"/>
       <w:r>
         <w:rPr>
           <w:rFonts w:ascii="Times New Roman" w:hAnsi="Times New Roman" w:cs="Times New Roman"/>
           <w:i/>
           <w:iCs/>
         </w:rPr>
-        <w:t>Hordeum</w:t>
-      </w:r>
-      <w:r>
-        <w:rPr>
-          <w:rFonts w:ascii="Times New Roman" w:hAnsi="Times New Roman" w:cs="Times New Roman"/>
-        </w:rPr>
-        <w:t xml:space="preserve">, </w:t>
-      </w:r>
-      <w:r>
-        <w:rPr>
-          <w:rFonts w:ascii="Times New Roman" w:hAnsi="Times New Roman" w:cs="Times New Roman"/>
-        </w:rPr>
-        <w:t xml:space="preserve">a broader taxonomic </w:t>
-      </w:r>
-      <w:r>
-        <w:rPr>
-          <w:rFonts w:ascii="Times New Roman" w:hAnsi="Times New Roman" w:cs="Times New Roman"/>
-        </w:rPr>
-        <w:t>range</w:t>
-      </w:r>
-      <w:r>
-        <w:rPr>
-          <w:rFonts w:ascii="Times New Roman" w:hAnsi="Times New Roman" w:cs="Times New Roman"/>
-        </w:rPr>
-        <w:t xml:space="preserve"> contributed to prediction accuracy, </w:t>
-      </w:r>
-      <w:r>
-        <w:rPr>
-          <w:rFonts w:ascii="Times New Roman" w:hAnsi="Times New Roman" w:cs="Times New Roman"/>
-        </w:rPr>
-        <w:t xml:space="preserve">with </w:t>
+        <w:t>Pseudomonadales</w:t>
+      </w:r>
+      <w:proofErr w:type="spellEnd"/>
+      <w:r>
+        <w:rPr>
+          <w:rFonts w:ascii="Times New Roman" w:hAnsi="Times New Roman" w:cs="Times New Roman"/>
+        </w:rPr>
+        <w:t xml:space="preserve"> and </w:t>
       </w:r>
       <w:proofErr w:type="spellStart"/>
       <w:r>
@@ -10013,79 +9937,101 @@
           <w:i/>
           <w:iCs/>
         </w:rPr>
-        <w:t>Flavobacteriales</w:t>
+        <w:t>Rhizobiales</w:t>
       </w:r>
       <w:proofErr w:type="spellEnd"/>
       <w:r>
         <w:rPr>
           <w:rFonts w:ascii="Times New Roman" w:hAnsi="Times New Roman" w:cs="Times New Roman"/>
         </w:rPr>
-        <w:t xml:space="preserve"> ASVs </w:t>
-      </w:r>
-      <w:r>
-        <w:rPr>
-          <w:rFonts w:ascii="Times New Roman" w:hAnsi="Times New Roman" w:cs="Times New Roman"/>
-        </w:rPr>
-        <w:lastRenderedPageBreak/>
-        <w:t>particularly important across all</w:t>
-      </w:r>
-      <w:r>
-        <w:rPr>
-          <w:rFonts w:ascii="Times New Roman" w:hAnsi="Times New Roman" w:cs="Times New Roman"/>
-        </w:rPr>
-        <w:t xml:space="preserve"> </w:t>
-      </w:r>
-      <w:r>
-        <w:rPr>
-          <w:rFonts w:ascii="Times New Roman" w:hAnsi="Times New Roman" w:cs="Times New Roman"/>
-        </w:rPr>
-        <w:t>soil-compartment</w:t>
-      </w:r>
-      <w:r>
-        <w:rPr>
-          <w:rFonts w:ascii="Times New Roman" w:hAnsi="Times New Roman" w:cs="Times New Roman"/>
-        </w:rPr>
-        <w:t xml:space="preserve"> combinations. </w:t>
-      </w:r>
-      <w:proofErr w:type="spellStart"/>
+        <w:t xml:space="preserve">, each displaying </w:t>
+      </w:r>
+      <w:r>
+        <w:rPr>
+          <w:rFonts w:ascii="Times New Roman" w:hAnsi="Times New Roman" w:cs="Times New Roman"/>
+        </w:rPr>
+        <w:t>compartment</w:t>
+      </w:r>
+      <w:r>
+        <w:rPr>
+          <w:rFonts w:ascii="Times New Roman" w:hAnsi="Times New Roman" w:cs="Times New Roman"/>
+        </w:rPr>
+        <w:t>- and soil-type-specific associations</w:t>
+      </w:r>
+      <w:r>
+        <w:rPr>
+          <w:rFonts w:ascii="Times New Roman" w:hAnsi="Times New Roman" w:cs="Times New Roman"/>
+        </w:rPr>
+        <w:t xml:space="preserve"> (</w:t>
+      </w:r>
+      <w:r>
+        <w:rPr>
+          <w:rFonts w:ascii="Times New Roman" w:hAnsi="Times New Roman" w:cs="Times New Roman"/>
+          <w:highlight w:val="magenta"/>
+        </w:rPr>
+        <w:t>Fig. 3D, Suppl. Table 2</w:t>
+      </w:r>
+      <w:r>
+        <w:rPr>
+          <w:rFonts w:ascii="Times New Roman" w:hAnsi="Times New Roman" w:cs="Times New Roman"/>
+        </w:rPr>
+        <w:t>)</w:t>
+      </w:r>
+      <w:r>
+        <w:rPr>
+          <w:rFonts w:ascii="Times New Roman" w:hAnsi="Times New Roman" w:cs="Times New Roman"/>
+        </w:rPr>
+        <w:t xml:space="preserve">. </w:t>
+      </w:r>
+      <w:r>
+        <w:rPr>
+          <w:rFonts w:ascii="Times New Roman" w:hAnsi="Times New Roman" w:cs="Times New Roman"/>
+        </w:rPr>
+        <w:t>In</w:t>
+      </w:r>
+      <w:r>
+        <w:rPr>
+          <w:rFonts w:ascii="Times New Roman" w:hAnsi="Times New Roman" w:cs="Times New Roman"/>
+        </w:rPr>
+        <w:t xml:space="preserve"> </w:t>
+      </w:r>
       <w:r>
         <w:rPr>
           <w:rFonts w:ascii="Times New Roman" w:hAnsi="Times New Roman" w:cs="Times New Roman"/>
           <w:i/>
           <w:iCs/>
         </w:rPr>
-        <w:t>Bacillales</w:t>
-      </w:r>
-      <w:proofErr w:type="spellEnd"/>
-      <w:r>
-        <w:rPr>
-          <w:rFonts w:ascii="Times New Roman" w:hAnsi="Times New Roman" w:cs="Times New Roman"/>
-        </w:rPr>
-        <w:t xml:space="preserve"> ASVs </w:t>
-      </w:r>
-      <w:r>
-        <w:rPr>
-          <w:rFonts w:ascii="Times New Roman" w:hAnsi="Times New Roman" w:cs="Times New Roman"/>
-        </w:rPr>
-        <w:t>were strong predictors of NPK cultivation</w:t>
-      </w:r>
-      <w:r>
-        <w:rPr>
-          <w:rFonts w:ascii="Times New Roman" w:hAnsi="Times New Roman" w:cs="Times New Roman"/>
-        </w:rPr>
-        <w:t xml:space="preserve"> in rhizosphere samples</w:t>
-      </w:r>
-      <w:r>
-        <w:rPr>
-          <w:rFonts w:ascii="Times New Roman" w:hAnsi="Times New Roman" w:cs="Times New Roman"/>
-        </w:rPr>
-        <w:t>,</w:t>
-      </w:r>
-      <w:r>
-        <w:rPr>
-          <w:rFonts w:ascii="Times New Roman" w:hAnsi="Times New Roman" w:cs="Times New Roman"/>
-        </w:rPr>
-        <w:t xml:space="preserve"> while </w:t>
+        <w:t>Hordeum</w:t>
+      </w:r>
+      <w:r>
+        <w:rPr>
+          <w:rFonts w:ascii="Times New Roman" w:hAnsi="Times New Roman" w:cs="Times New Roman"/>
+        </w:rPr>
+        <w:t xml:space="preserve">, </w:t>
+      </w:r>
+      <w:r>
+        <w:rPr>
+          <w:rFonts w:ascii="Times New Roman" w:hAnsi="Times New Roman" w:cs="Times New Roman"/>
+        </w:rPr>
+        <w:t xml:space="preserve">a broader taxonomic </w:t>
+      </w:r>
+      <w:r>
+        <w:rPr>
+          <w:rFonts w:ascii="Times New Roman" w:hAnsi="Times New Roman" w:cs="Times New Roman"/>
+        </w:rPr>
+        <w:t>range</w:t>
+      </w:r>
+      <w:r>
+        <w:rPr>
+          <w:rFonts w:ascii="Times New Roman" w:hAnsi="Times New Roman" w:cs="Times New Roman"/>
+        </w:rPr>
+        <w:t xml:space="preserve"> contributed to prediction accuracy, </w:t>
+      </w:r>
+      <w:r>
+        <w:rPr>
+          <w:rFonts w:ascii="Times New Roman" w:hAnsi="Times New Roman" w:cs="Times New Roman"/>
+        </w:rPr>
+        <w:t xml:space="preserve">with </w:t>
       </w:r>
       <w:proofErr w:type="spellStart"/>
       <w:r>
@@ -10094,118 +10040,61 @@
           <w:i/>
           <w:iCs/>
         </w:rPr>
-        <w:t>Pseudonocardiales</w:t>
+        <w:lastRenderedPageBreak/>
+        <w:t>Burkholderiales</w:t>
       </w:r>
       <w:proofErr w:type="spellEnd"/>
       <w:r>
         <w:rPr>
           <w:rFonts w:ascii="Times New Roman" w:hAnsi="Times New Roman" w:cs="Times New Roman"/>
         </w:rPr>
-        <w:t xml:space="preserve"> ASVs </w:t>
-      </w:r>
-      <w:r>
-        <w:rPr>
-          <w:rFonts w:ascii="Times New Roman" w:hAnsi="Times New Roman" w:cs="Times New Roman"/>
-        </w:rPr>
-        <w:t>were crucial for</w:t>
-      </w:r>
-      <w:r>
-        <w:rPr>
-          <w:rFonts w:ascii="Times New Roman" w:hAnsi="Times New Roman" w:cs="Times New Roman"/>
-        </w:rPr>
-        <w:t xml:space="preserve"> PK prediction</w:t>
-      </w:r>
-      <w:r>
-        <w:rPr>
-          <w:rFonts w:ascii="Times New Roman" w:hAnsi="Times New Roman" w:cs="Times New Roman"/>
-        </w:rPr>
-        <w:t>s</w:t>
-      </w:r>
-      <w:r>
-        <w:rPr>
-          <w:rFonts w:ascii="Times New Roman" w:hAnsi="Times New Roman" w:cs="Times New Roman"/>
-        </w:rPr>
-        <w:t xml:space="preserve"> for root samples</w:t>
-      </w:r>
-      <w:r>
-        <w:rPr>
-          <w:rFonts w:ascii="Times New Roman" w:hAnsi="Times New Roman" w:cs="Times New Roman"/>
-        </w:rPr>
-        <w:t>.</w:t>
-      </w:r>
-      <w:r>
-        <w:rPr>
-          <w:rFonts w:ascii="Times New Roman" w:hAnsi="Times New Roman" w:cs="Times New Roman"/>
-        </w:rPr>
-        <w:t xml:space="preserve"> </w:t>
-      </w:r>
-      <w:r>
-        <w:rPr>
-          <w:rFonts w:ascii="Times New Roman" w:hAnsi="Times New Roman" w:cs="Times New Roman"/>
-        </w:rPr>
-        <w:t>Additional</w:t>
-      </w:r>
-      <w:r>
-        <w:rPr>
-          <w:rFonts w:ascii="Times New Roman" w:hAnsi="Times New Roman" w:cs="Times New Roman"/>
-        </w:rPr>
-        <w:t xml:space="preserve"> </w:t>
-      </w:r>
-      <w:r>
-        <w:rPr>
-          <w:rFonts w:ascii="Times New Roman" w:hAnsi="Times New Roman" w:cs="Times New Roman"/>
-        </w:rPr>
-        <w:t xml:space="preserve">predictive </w:t>
-      </w:r>
-      <w:r>
-        <w:rPr>
-          <w:rFonts w:ascii="Times New Roman" w:hAnsi="Times New Roman" w:cs="Times New Roman"/>
-        </w:rPr>
-        <w:t xml:space="preserve">orders included </w:t>
-      </w:r>
-      <w:proofErr w:type="spellStart"/>
+        <w:t xml:space="preserve">, </w:t>
+      </w:r>
       <w:r>
         <w:rPr>
           <w:rFonts w:ascii="Times New Roman" w:hAnsi="Times New Roman" w:cs="Times New Roman"/>
           <w:i/>
           <w:iCs/>
         </w:rPr>
-        <w:t>Burkholderiales</w:t>
-      </w:r>
-      <w:proofErr w:type="spellEnd"/>
-      <w:r>
-        <w:rPr>
-          <w:rFonts w:ascii="Times New Roman" w:hAnsi="Times New Roman" w:cs="Times New Roman"/>
-        </w:rPr>
-        <w:t>,</w:t>
-      </w:r>
-      <w:r>
-        <w:rPr>
-          <w:rFonts w:ascii="Times New Roman" w:hAnsi="Times New Roman" w:cs="Times New Roman"/>
-        </w:rPr>
-        <w:t xml:space="preserve"> </w:t>
-      </w:r>
+        <w:t>Caulobacterales</w:t>
+      </w:r>
+      <w:r>
+        <w:rPr>
+          <w:rFonts w:ascii="Times New Roman" w:hAnsi="Times New Roman" w:cs="Times New Roman"/>
+        </w:rPr>
+        <w:t xml:space="preserve">, </w:t>
+      </w:r>
+      <w:proofErr w:type="spellStart"/>
       <w:r>
         <w:rPr>
           <w:rFonts w:ascii="Times New Roman" w:hAnsi="Times New Roman" w:cs="Times New Roman"/>
           <w:i/>
           <w:iCs/>
         </w:rPr>
-        <w:t>Caulobacterales</w:t>
-      </w:r>
-      <w:r>
-        <w:rPr>
-          <w:rFonts w:ascii="Times New Roman" w:hAnsi="Times New Roman" w:cs="Times New Roman"/>
-        </w:rPr>
-        <w:t>,</w:t>
-      </w:r>
+        <w:t>Flavobacteriales</w:t>
+      </w:r>
+      <w:proofErr w:type="spellEnd"/>
+      <w:r>
+        <w:rPr>
+          <w:rFonts w:ascii="Times New Roman" w:hAnsi="Times New Roman" w:cs="Times New Roman"/>
+        </w:rPr>
+        <w:t xml:space="preserve">, </w:t>
+      </w:r>
+      <w:proofErr w:type="spellStart"/>
       <w:r>
         <w:rPr>
           <w:rFonts w:ascii="Times New Roman" w:hAnsi="Times New Roman" w:cs="Times New Roman"/>
           <w:i/>
           <w:iCs/>
         </w:rPr>
-        <w:t xml:space="preserve"> </w:t>
+        <w:t>Pseudomonadales</w:t>
+      </w:r>
+      <w:proofErr w:type="spellEnd"/>
+      <w:r>
+        <w:rPr>
+          <w:rFonts w:ascii="Times New Roman" w:hAnsi="Times New Roman" w:cs="Times New Roman"/>
+        </w:rPr>
+        <w:t xml:space="preserve">, and </w:t>
       </w:r>
       <w:proofErr w:type="spellStart"/>
       <w:r>
@@ -10214,69 +10103,161 @@
           <w:i/>
           <w:iCs/>
         </w:rPr>
-        <w:t>Pseudo</w:t>
-      </w:r>
+        <w:t>Streptomycetales</w:t>
+      </w:r>
+      <w:proofErr w:type="spellEnd"/>
+      <w:r>
+        <w:rPr>
+          <w:rFonts w:ascii="Times New Roman" w:hAnsi="Times New Roman" w:cs="Times New Roman"/>
+        </w:rPr>
+        <w:t xml:space="preserve"> ASVs </w:t>
+      </w:r>
+      <w:r>
+        <w:rPr>
+          <w:rFonts w:ascii="Times New Roman" w:hAnsi="Times New Roman" w:cs="Times New Roman"/>
+        </w:rPr>
+        <w:t>particularly important across all</w:t>
+      </w:r>
+      <w:r>
+        <w:rPr>
+          <w:rFonts w:ascii="Times New Roman" w:hAnsi="Times New Roman" w:cs="Times New Roman"/>
+        </w:rPr>
+        <w:t xml:space="preserve"> </w:t>
+      </w:r>
+      <w:r>
+        <w:rPr>
+          <w:rFonts w:ascii="Times New Roman" w:hAnsi="Times New Roman" w:cs="Times New Roman"/>
+        </w:rPr>
+        <w:t>soil-compartment</w:t>
+      </w:r>
+      <w:r>
+        <w:rPr>
+          <w:rFonts w:ascii="Times New Roman" w:hAnsi="Times New Roman" w:cs="Times New Roman"/>
+        </w:rPr>
+        <w:t xml:space="preserve"> combinations. </w:t>
+      </w:r>
+      <w:proofErr w:type="spellStart"/>
       <w:r>
         <w:rPr>
           <w:rFonts w:ascii="Times New Roman" w:hAnsi="Times New Roman" w:cs="Times New Roman"/>
           <w:i/>
           <w:iCs/>
         </w:rPr>
-        <w:t>mon</w:t>
-      </w:r>
+        <w:t>Pseudonocardiales</w:t>
+      </w:r>
+      <w:proofErr w:type="spellEnd"/>
+      <w:r>
+        <w:rPr>
+          <w:rFonts w:ascii="Times New Roman" w:hAnsi="Times New Roman" w:cs="Times New Roman"/>
+        </w:rPr>
+        <w:t xml:space="preserve"> </w:t>
+      </w:r>
+      <w:r>
+        <w:rPr>
+          <w:rFonts w:ascii="Times New Roman" w:hAnsi="Times New Roman" w:cs="Times New Roman"/>
+        </w:rPr>
+        <w:t xml:space="preserve">ASVs </w:t>
+      </w:r>
+      <w:r>
+        <w:rPr>
+          <w:rFonts w:ascii="Times New Roman" w:hAnsi="Times New Roman" w:cs="Times New Roman"/>
+        </w:rPr>
+        <w:t xml:space="preserve">were </w:t>
+      </w:r>
+      <w:r>
+        <w:rPr>
+          <w:rFonts w:ascii="Times New Roman" w:hAnsi="Times New Roman" w:cs="Times New Roman"/>
+        </w:rPr>
+        <w:t xml:space="preserve">additional </w:t>
+      </w:r>
+      <w:r>
+        <w:rPr>
+          <w:rFonts w:ascii="Times New Roman" w:hAnsi="Times New Roman" w:cs="Times New Roman"/>
+        </w:rPr>
+        <w:t>predictors of PK cultivation</w:t>
+      </w:r>
+      <w:r>
+        <w:rPr>
+          <w:rFonts w:ascii="Times New Roman" w:hAnsi="Times New Roman" w:cs="Times New Roman"/>
+        </w:rPr>
+        <w:t xml:space="preserve"> in rhizosphere samples</w:t>
+      </w:r>
+      <w:r>
+        <w:rPr>
+          <w:rFonts w:ascii="Times New Roman" w:hAnsi="Times New Roman" w:cs="Times New Roman"/>
+        </w:rPr>
+        <w:t>,</w:t>
+      </w:r>
+      <w:r>
+        <w:rPr>
+          <w:rFonts w:ascii="Times New Roman" w:hAnsi="Times New Roman" w:cs="Times New Roman"/>
+        </w:rPr>
+        <w:t xml:space="preserve"> while </w:t>
+      </w:r>
+      <w:proofErr w:type="spellStart"/>
       <w:r>
         <w:rPr>
           <w:rFonts w:ascii="Times New Roman" w:hAnsi="Times New Roman" w:cs="Times New Roman"/>
           <w:i/>
           <w:iCs/>
         </w:rPr>
-        <w:t>adales</w:t>
+        <w:t>Cellvibrionales</w:t>
       </w:r>
       <w:proofErr w:type="spellEnd"/>
       <w:r>
         <w:rPr>
           <w:rFonts w:ascii="Times New Roman" w:hAnsi="Times New Roman" w:cs="Times New Roman"/>
         </w:rPr>
-        <w:t xml:space="preserve">, </w:t>
-      </w:r>
-      <w:proofErr w:type="spellStart"/>
-      <w:r>
-        <w:rPr>
-          <w:rFonts w:ascii="Times New Roman" w:hAnsi="Times New Roman" w:cs="Times New Roman"/>
-          <w:i/>
-          <w:iCs/>
-        </w:rPr>
-        <w:t>Rhizobiales</w:t>
-      </w:r>
-      <w:proofErr w:type="spellEnd"/>
-      <w:r>
-        <w:rPr>
-          <w:rFonts w:ascii="Times New Roman" w:hAnsi="Times New Roman" w:cs="Times New Roman"/>
-        </w:rPr>
-        <w:t>,</w:t>
-      </w:r>
-      <w:r>
-        <w:rPr>
-          <w:rFonts w:ascii="Times New Roman" w:hAnsi="Times New Roman" w:cs="Times New Roman"/>
-        </w:rPr>
-        <w:t xml:space="preserve"> and</w:t>
-      </w:r>
-      <w:r>
-        <w:rPr>
-          <w:rFonts w:ascii="Times New Roman" w:hAnsi="Times New Roman" w:cs="Times New Roman"/>
-        </w:rPr>
-        <w:t xml:space="preserve"> </w:t>
-      </w:r>
-      <w:proofErr w:type="spellStart"/>
-      <w:r>
-        <w:rPr>
-          <w:rFonts w:ascii="Times New Roman" w:hAnsi="Times New Roman" w:cs="Times New Roman"/>
-          <w:i/>
-          <w:iCs/>
-        </w:rPr>
-        <w:t>Streptomycetales</w:t>
-      </w:r>
-      <w:proofErr w:type="spellEnd"/>
+        <w:t xml:space="preserve"> </w:t>
+      </w:r>
+      <w:r>
+        <w:rPr>
+          <w:rFonts w:ascii="Times New Roman" w:hAnsi="Times New Roman" w:cs="Times New Roman"/>
+        </w:rPr>
+        <w:t>ASVs</w:t>
+      </w:r>
+      <w:r>
+        <w:rPr>
+          <w:rFonts w:ascii="Times New Roman" w:hAnsi="Times New Roman" w:cs="Times New Roman"/>
+        </w:rPr>
+        <w:t xml:space="preserve"> </w:t>
+      </w:r>
+      <w:r>
+        <w:rPr>
+          <w:rFonts w:ascii="Times New Roman" w:hAnsi="Times New Roman" w:cs="Times New Roman"/>
+        </w:rPr>
+        <w:t xml:space="preserve">were </w:t>
+      </w:r>
+      <w:r>
+        <w:rPr>
+          <w:rFonts w:ascii="Times New Roman" w:hAnsi="Times New Roman" w:cs="Times New Roman"/>
+        </w:rPr>
+        <w:t>used</w:t>
+      </w:r>
+      <w:r>
+        <w:rPr>
+          <w:rFonts w:ascii="Times New Roman" w:hAnsi="Times New Roman" w:cs="Times New Roman"/>
+        </w:rPr>
+        <w:t xml:space="preserve"> for</w:t>
+      </w:r>
+      <w:r>
+        <w:rPr>
+          <w:rFonts w:ascii="Times New Roman" w:hAnsi="Times New Roman" w:cs="Times New Roman"/>
+        </w:rPr>
+        <w:t xml:space="preserve"> PK prediction</w:t>
+      </w:r>
+      <w:r>
+        <w:rPr>
+          <w:rFonts w:ascii="Times New Roman" w:hAnsi="Times New Roman" w:cs="Times New Roman"/>
+        </w:rPr>
+        <w:t>s</w:t>
+      </w:r>
+      <w:r>
+        <w:rPr>
+          <w:rFonts w:ascii="Times New Roman" w:hAnsi="Times New Roman" w:cs="Times New Roman"/>
+        </w:rPr>
+        <w:t xml:space="preserve"> for root samples</w:t>
+      </w:r>
       <w:r>
         <w:rPr>
           <w:rFonts w:ascii="Times New Roman" w:hAnsi="Times New Roman" w:cs="Times New Roman"/>
@@ -10314,7 +10295,6 @@
         </w:rPr>
         <w:t xml:space="preserve"> </w:t>
       </w:r>
-      <w:commentRangeStart w:id="4"/>
       <w:r>
         <w:rPr>
           <w:rFonts w:ascii="Times New Roman" w:hAnsi="Times New Roman" w:cs="Times New Roman"/>
@@ -10349,7 +10329,19 @@
         <w:rPr>
           <w:rFonts w:ascii="Times New Roman" w:hAnsi="Times New Roman" w:cs="Times New Roman"/>
         </w:rPr>
-        <w:t xml:space="preserve"> and were not conserved across </w:t>
+        <w:t xml:space="preserve"> and were </w:t>
+      </w:r>
+      <w:r>
+        <w:rPr>
+          <w:rFonts w:ascii="Times New Roman" w:hAnsi="Times New Roman" w:cs="Times New Roman"/>
+        </w:rPr>
+        <w:t>only partially</w:t>
+      </w:r>
+      <w:r>
+        <w:rPr>
+          <w:rFonts w:ascii="Times New Roman" w:hAnsi="Times New Roman" w:cs="Times New Roman"/>
+        </w:rPr>
+        <w:t xml:space="preserve"> conserved across </w:t>
       </w:r>
       <w:r>
         <w:rPr>
@@ -10459,25 +10451,11 @@
         </w:rPr>
         <w:t>.</w:t>
       </w:r>
-      <w:commentRangeEnd w:id="4"/>
-      <w:r>
-        <w:rPr>
-          <w:rStyle w:val="CommentReference"/>
-        </w:rPr>
-        <w:commentReference w:id="4"/>
-      </w:r>
-      <w:r>
-        <w:rPr>
-          <w:rFonts w:ascii="Times New Roman" w:hAnsi="Times New Roman" w:cs="Times New Roman"/>
-        </w:rPr>
-        <w:t xml:space="preserve"> </w:t>
-      </w:r>
-      <w:commentRangeEnd w:id="3"/>
-      <w:r>
-        <w:rPr>
-          <w:rStyle w:val="CommentReference"/>
-        </w:rPr>
-        <w:commentReference w:id="3"/>
+      <w:r>
+        <w:rPr>
+          <w:rFonts w:ascii="Times New Roman" w:hAnsi="Times New Roman" w:cs="Times New Roman"/>
+        </w:rPr>
+        <w:t xml:space="preserve"> </w:t>
       </w:r>
       <w:r>
         <w:rPr>
@@ -12280,7 +12258,7 @@
         </w:rPr>
         <w:t xml:space="preserve"> (</w:t>
       </w:r>
-      <w:commentRangeStart w:id="5"/>
+      <w:commentRangeStart w:id="1"/>
       <w:r>
         <w:rPr>
           <w:rFonts w:ascii="Times New Roman" w:hAnsi="Times New Roman" w:cs="Times New Roman"/>
@@ -12289,7 +12267,7 @@
         </w:rPr>
         <w:t>Suppl. Fig. 4</w:t>
       </w:r>
-      <w:commentRangeEnd w:id="5"/>
+      <w:commentRangeEnd w:id="1"/>
       <w:r>
         <w:rPr>
           <w:rFonts w:ascii="Times New Roman" w:hAnsi="Times New Roman" w:cs="Times New Roman"/>
@@ -12301,7 +12279,7 @@
         <w:rPr>
           <w:rStyle w:val="CommentReference"/>
         </w:rPr>
-        <w:commentReference w:id="5"/>
+        <w:commentReference w:id="1"/>
       </w:r>
       <w:r>
         <w:rPr>
@@ -12761,15 +12739,7 @@
           <w:rFonts w:ascii="Times New Roman" w:hAnsi="Times New Roman" w:cs="Times New Roman"/>
           <w:kern w:val="0"/>
         </w:rPr>
-        <w:t xml:space="preserve">most likely symbiotic </w:t>
-      </w:r>
-      <w:r>
-        <w:rPr>
-          <w:rFonts w:ascii="Times New Roman" w:hAnsi="Times New Roman" w:cs="Times New Roman"/>
-          <w:kern w:val="0"/>
-        </w:rPr>
-        <w:lastRenderedPageBreak/>
-        <w:t xml:space="preserve">rhizobia, </w:t>
+        <w:t xml:space="preserve">most likely symbiotic rhizobia, </w:t>
       </w:r>
       <w:r>
         <w:rPr>
@@ -12851,6 +12821,7 @@
           <w:iCs/>
           <w:kern w:val="0"/>
         </w:rPr>
+        <w:lastRenderedPageBreak/>
         <w:t>Burkholderiales</w:t>
       </w:r>
       <w:proofErr w:type="spellEnd"/>
@@ -13714,19 +13685,19 @@
         </w:rPr>
         <w:t xml:space="preserve"> detected approximately </w:t>
       </w:r>
-      <w:commentRangeStart w:id="6"/>
+      <w:commentRangeStart w:id="2"/>
       <w:r>
         <w:rPr>
           <w:rFonts w:ascii="Times New Roman" w:hAnsi="Times New Roman" w:cs="Times New Roman"/>
         </w:rPr>
         <w:t xml:space="preserve">580 and 1912 </w:t>
       </w:r>
-      <w:commentRangeEnd w:id="6"/>
+      <w:commentRangeEnd w:id="2"/>
       <w:r>
         <w:rPr>
           <w:rStyle w:val="CommentReference"/>
         </w:rPr>
-        <w:commentReference w:id="6"/>
+        <w:commentReference w:id="2"/>
       </w:r>
       <w:r>
         <w:rPr>
@@ -13786,19 +13757,19 @@
         </w:rPr>
         <w:t xml:space="preserve"> metabolites spanned diverse chemical classes, including </w:t>
       </w:r>
-      <w:commentRangeStart w:id="7"/>
+      <w:commentRangeStart w:id="3"/>
       <w:r>
         <w:rPr>
           <w:rFonts w:ascii="Times New Roman" w:hAnsi="Times New Roman" w:cs="Times New Roman"/>
         </w:rPr>
         <w:t xml:space="preserve">alkaloids, amino acids and peptides, fatty acids, carbohydrates, shikimates and phenylpropanoids, terpenoids, and polyketides </w:t>
       </w:r>
-      <w:commentRangeEnd w:id="7"/>
+      <w:commentRangeEnd w:id="3"/>
       <w:r>
         <w:rPr>
           <w:rStyle w:val="CommentReference"/>
         </w:rPr>
-        <w:commentReference w:id="7"/>
+        <w:commentReference w:id="3"/>
       </w:r>
       <w:r>
         <w:rPr>
@@ -13806,7 +13777,7 @@
         </w:rPr>
         <w:t>(</w:t>
       </w:r>
-      <w:commentRangeStart w:id="8"/>
+      <w:commentRangeStart w:id="4"/>
       <w:r>
         <w:rPr>
           <w:rFonts w:ascii="Times New Roman" w:hAnsi="Times New Roman" w:cs="Times New Roman"/>
@@ -13828,12 +13799,12 @@
         </w:rPr>
         <w:t>5A</w:t>
       </w:r>
-      <w:commentRangeEnd w:id="8"/>
+      <w:commentRangeEnd w:id="4"/>
       <w:r>
         <w:rPr>
           <w:rStyle w:val="CommentReference"/>
         </w:rPr>
-        <w:commentReference w:id="8"/>
+        <w:commentReference w:id="4"/>
       </w:r>
       <w:r>
         <w:rPr>
@@ -13931,7 +13902,7 @@
           <w:rFonts w:ascii="Times New Roman" w:hAnsi="Times New Roman" w:cs="Times New Roman"/>
         </w:rPr>
       </w:pPr>
-      <w:commentRangeStart w:id="9"/>
+      <w:commentRangeStart w:id="5"/>
       <w:r>
         <w:rPr>
           <w:rFonts w:ascii="Times New Roman" w:hAnsi="Times New Roman" w:cs="Times New Roman"/>
@@ -14000,12 +13971,12 @@
         </w:rPr>
         <w:t xml:space="preserve"> </w:t>
       </w:r>
-      <w:commentRangeEnd w:id="9"/>
+      <w:commentRangeEnd w:id="5"/>
       <w:r>
         <w:rPr>
           <w:rStyle w:val="CommentReference"/>
         </w:rPr>
-        <w:commentReference w:id="9"/>
+        <w:commentReference w:id="5"/>
       </w:r>
       <w:r>
         <w:rPr>
@@ -17470,19 +17441,19 @@
         </w:rPr>
         <w:t xml:space="preserve"> </w:t>
       </w:r>
-      <w:commentRangeStart w:id="10"/>
+      <w:commentRangeStart w:id="6"/>
       <w:r>
         <w:rPr>
           <w:rFonts w:ascii="Times New Roman" w:hAnsi="Times New Roman" w:cs="Times New Roman"/>
         </w:rPr>
         <w:t>65%</w:t>
       </w:r>
-      <w:commentRangeEnd w:id="10"/>
+      <w:commentRangeEnd w:id="6"/>
       <w:r>
         <w:rPr>
           <w:rStyle w:val="CommentReference"/>
         </w:rPr>
-        <w:commentReference w:id="10"/>
+        <w:commentReference w:id="6"/>
       </w:r>
       <w:r>
         <w:rPr>
@@ -27284,7 +27255,7 @@
         </w:rPr>
         <w:t xml:space="preserve"> </w:t>
       </w:r>
-      <w:commentRangeStart w:id="11"/>
+      <w:commentRangeStart w:id="7"/>
       <w:r>
         <w:rPr>
           <w:rFonts w:ascii="Times New Roman" w:hAnsi="Times New Roman" w:cs="Times New Roman"/>
@@ -27292,12 +27263,12 @@
         </w:rPr>
         <w:t>ASVs not matching any member of the SynCom reference set were removed prior to downstream analysis.</w:t>
       </w:r>
-      <w:commentRangeEnd w:id="11"/>
+      <w:commentRangeEnd w:id="7"/>
       <w:r>
         <w:rPr>
           <w:rStyle w:val="CommentReference"/>
         </w:rPr>
-        <w:commentReference w:id="11"/>
+        <w:commentReference w:id="7"/>
       </w:r>
     </w:p>
     <w:p>
@@ -28930,7 +28901,7 @@
         </w:rPr>
         <w:t xml:space="preserve"> </w:t>
       </w:r>
-      <w:commentRangeStart w:id="12"/>
+      <w:commentRangeStart w:id="8"/>
       <w:r>
         <w:rPr>
           <w:rFonts w:ascii="Times New Roman" w:hAnsi="Times New Roman" w:cs="Times New Roman"/>
@@ -28938,12 +28909,12 @@
         </w:rPr>
         <w:t>CHECK WHETHER ANYTHING MISSING</w:t>
       </w:r>
-      <w:commentRangeEnd w:id="12"/>
+      <w:commentRangeEnd w:id="8"/>
       <w:r>
         <w:rPr>
           <w:rStyle w:val="CommentReference"/>
         </w:rPr>
-        <w:commentReference w:id="12"/>
+        <w:commentReference w:id="8"/>
       </w:r>
     </w:p>
     <w:p>
@@ -29391,25 +29362,7 @@
           <w:bCs/>
           <w:color w:val="333333"/>
         </w:rPr>
-        <w:t xml:space="preserve">whether a </w:t>
-      </w:r>
-      <w:proofErr w:type="gramStart"/>
-      <w:r>
-        <w:rPr>
-          <w:rFonts w:ascii="Times New Roman" w:hAnsi="Times New Roman" w:cs="Times New Roman"/>
-          <w:bCs/>
-          <w:color w:val="333333"/>
-        </w:rPr>
-        <w:t>samples</w:t>
-      </w:r>
-      <w:proofErr w:type="gramEnd"/>
-      <w:r>
-        <w:rPr>
-          <w:rFonts w:ascii="Times New Roman" w:hAnsi="Times New Roman" w:cs="Times New Roman"/>
-          <w:bCs/>
-          <w:color w:val="333333"/>
-        </w:rPr>
-        <w:t xml:space="preserve"> originates from </w:t>
+        <w:t xml:space="preserve">whether a sample originates from </w:t>
       </w:r>
       <w:r>
         <w:rPr>
@@ -29622,6 +29575,14 @@
           <w:color w:val="333333"/>
         </w:rPr>
         <w:t>.</w:t>
+      </w:r>
+      <w:r>
+        <w:rPr>
+          <w:rFonts w:ascii="Times New Roman" w:hAnsi="Times New Roman" w:cs="Times New Roman"/>
+          <w:bCs/>
+          <w:color w:val="333333"/>
+        </w:rPr>
+        <w:t xml:space="preserve"> Analysis only included bacterial ASVs.</w:t>
       </w:r>
     </w:p>
     <w:p>
@@ -30492,7 +30453,15 @@
           <w:rFonts w:ascii="Times New Roman" w:hAnsi="Times New Roman" w:cs="Times New Roman"/>
           <w:color w:val="333333"/>
         </w:rPr>
-        <w:t xml:space="preserve"> Unplanted </w:t>
+        <w:t xml:space="preserve"> </w:t>
+      </w:r>
+      <w:r>
+        <w:rPr>
+          <w:rFonts w:ascii="Times New Roman" w:hAnsi="Times New Roman" w:cs="Times New Roman"/>
+          <w:color w:val="333333"/>
+        </w:rPr>
+        <w:lastRenderedPageBreak/>
+        <w:t xml:space="preserve">Unplanted </w:t>
       </w:r>
       <w:r>
         <w:rPr>
@@ -31883,7 +31852,7 @@
         </w:rPr>
         <w:t xml:space="preserve"> Tobit regression </w:t>
       </w:r>
-      <w:commentRangeStart w:id="13"/>
+      <w:commentRangeStart w:id="9"/>
       <w:r>
         <w:rPr>
           <w:rFonts w:ascii="Times New Roman" w:hAnsi="Times New Roman" w:cs="Times New Roman"/>
@@ -31906,9 +31875,9 @@
         </w:rPr>
         <w:t>]</w:t>
       </w:r>
-      <w:commentRangeEnd w:id="13"/>
-      <w:r>
-        <w:commentReference w:id="13"/>
+      <w:commentRangeEnd w:id="9"/>
+      <w:r>
+        <w:commentReference w:id="9"/>
       </w:r>
       <w:r>
         <w:rPr>
@@ -32022,7 +31991,7 @@
         </w:rPr>
         <w:t xml:space="preserve">nalysis (PCA) </w:t>
       </w:r>
-      <w:commentRangeStart w:id="14"/>
+      <w:commentRangeStart w:id="10"/>
       <w:r>
         <w:rPr>
           <w:rFonts w:ascii="Times New Roman" w:hAnsi="Times New Roman" w:cs="Times New Roman"/>
@@ -32030,7 +31999,7 @@
         </w:rPr>
         <w:t>[</w:t>
       </w:r>
-      <w:commentRangeEnd w:id="14"/>
+      <w:commentRangeEnd w:id="10"/>
       <w:r>
         <w:rPr>
           <w:rFonts w:ascii="Times New Roman" w:hAnsi="Times New Roman" w:cs="Times New Roman"/>
@@ -32047,7 +32016,7 @@
         <w:t>]</w:t>
       </w:r>
       <w:r>
-        <w:commentReference w:id="14"/>
+        <w:commentReference w:id="10"/>
       </w:r>
       <w:r>
         <w:rPr>
@@ -32168,7 +32137,7 @@
         </w:rPr>
         <w:t xml:space="preserve">. </w:t>
       </w:r>
-      <w:commentRangeStart w:id="15"/>
+      <w:commentRangeStart w:id="11"/>
       <w:r>
         <w:rPr>
           <w:rFonts w:ascii="Times New Roman" w:hAnsi="Times New Roman" w:cs="Times New Roman"/>
@@ -32192,12 +32161,12 @@
         </w:rPr>
         <w:t xml:space="preserve"> class, where only classes with at least two metabolites are differentially exudated in at least one mutant compared to WT</w:t>
       </w:r>
-      <w:commentRangeEnd w:id="15"/>
+      <w:commentRangeEnd w:id="11"/>
       <w:r>
         <w:rPr>
           <w:rStyle w:val="CommentReference"/>
         </w:rPr>
-        <w:commentReference w:id="15"/>
+        <w:commentReference w:id="11"/>
       </w:r>
       <w:r>
         <w:rPr>
@@ -32291,6 +32260,7 @@
         <w:rPr>
           <w:rFonts w:ascii="Times New Roman" w:hAnsi="Times New Roman" w:cs="Times New Roman"/>
         </w:rPr>
+        <w:lastRenderedPageBreak/>
         <w:t xml:space="preserve">All scripts and datasets used to reproduce the figures for this study have been deposited at </w:t>
       </w:r>
       <w:r>
@@ -32355,14 +32325,7 @@
         <w:rPr>
           <w:rFonts w:ascii="Times New Roman" w:hAnsi="Times New Roman" w:cs="Times New Roman"/>
         </w:rPr>
-        <w:t xml:space="preserve">. The metabolic raw </w:t>
-      </w:r>
-      <w:r>
-        <w:rPr>
-          <w:rFonts w:ascii="Times New Roman" w:hAnsi="Times New Roman" w:cs="Times New Roman"/>
-        </w:rPr>
-        <w:lastRenderedPageBreak/>
-        <w:t xml:space="preserve">data files are stores as </w:t>
+        <w:t xml:space="preserve">. The metabolic raw data files are stores as </w:t>
       </w:r>
       <w:proofErr w:type="spellStart"/>
       <w:proofErr w:type="gramStart"/>
@@ -32472,7 +32435,7 @@
           <w:bCs/>
         </w:rPr>
       </w:pPr>
-      <w:commentRangeStart w:id="16"/>
+      <w:commentRangeStart w:id="12"/>
       <w:r>
         <w:rPr>
           <w:rFonts w:ascii="Times New Roman" w:hAnsi="Times New Roman" w:cs="Times New Roman"/>
@@ -32489,12 +32452,12 @@
         </w:rPr>
         <w:t xml:space="preserve"> and funding sources</w:t>
       </w:r>
-      <w:commentRangeEnd w:id="16"/>
+      <w:commentRangeEnd w:id="12"/>
       <w:r>
         <w:rPr>
           <w:rStyle w:val="CommentReference"/>
         </w:rPr>
-        <w:commentReference w:id="16"/>
+        <w:commentReference w:id="12"/>
       </w:r>
     </w:p>
     <w:p>
@@ -33429,6 +33392,7 @@
         <w:rPr>
           <w:rFonts w:ascii="Times New Roman" w:hAnsi="Times New Roman" w:cs="Times New Roman"/>
         </w:rPr>
+        <w:lastRenderedPageBreak/>
         <w:t xml:space="preserve">12. </w:t>
       </w:r>
       <w:r>
@@ -33492,7 +33456,6 @@
         <w:rPr>
           <w:rFonts w:ascii="Times New Roman" w:hAnsi="Times New Roman" w:cs="Times New Roman"/>
         </w:rPr>
-        <w:lastRenderedPageBreak/>
         <w:t xml:space="preserve">13. </w:t>
       </w:r>
       <w:r>
@@ -34237,7 +34200,7 @@
       </w:r>
     </w:p>
   </w:comment>
-  <w:comment w:id="1" w:author="Anna Marie Martyn" w:date="2026-02-03T09:35:00Z" w:initials="AMM">
+  <w:comment w:id="1" w:author="Anna Marie Martyn" w:date="2026-01-05T21:30:00Z" w:initials="AMM">
     <w:p>
       <w:pPr>
         <w:pStyle w:val="CommentText"/>
@@ -34249,11 +34212,17 @@
         <w:annotationRef/>
       </w:r>
       <w:r>
-        <w:t>CHECK ONCE ANALYSIS FINISHED</w:t>
+        <w:t>Do we need an additional figure that shows the abundance of the nodule ASVs (detected earlier in WT suppl. Figure</w:t>
+      </w:r>
+      <w:r>
+        <w:t xml:space="preserve"> 1</w:t>
+      </w:r>
+      <w:r>
+        <w:t>) across WT and mutant root compartment, or is it sufficient to leave it as is?</w:t>
       </w:r>
     </w:p>
   </w:comment>
-  <w:comment w:id="2" w:author="Anna Marie Martyn" w:date="2026-01-05T20:20:00Z" w:initials="AMM">
+  <w:comment w:id="2" w:author="Anna Marie Martyn" w:date="2026-01-05T22:22:00Z" w:initials="AMM">
     <w:p>
       <w:pPr>
         <w:pStyle w:val="CommentText"/>
@@ -34265,11 +34234,11 @@
         <w:annotationRef/>
       </w:r>
       <w:r>
-        <w:t>@Ib - could you add the correct numbers here please?</w:t>
+        <w:t>@Ib – please check final numbers here</w:t>
       </w:r>
     </w:p>
   </w:comment>
-  <w:comment w:id="4" w:author="Anna Marie Martyn" w:date="2026-01-05T20:50:00Z" w:initials="AMM">
+  <w:comment w:id="3" w:author="Anna Marie Martyn" w:date="2026-01-05T23:40:00Z" w:initials="AMM">
     <w:p>
       <w:pPr>
         <w:pStyle w:val="CommentText"/>
@@ -34283,17 +34252,15 @@
       <w:r>
         <w:t xml:space="preserve">@ </w:t>
       </w:r>
-      <w:proofErr w:type="spellStart"/>
-      <w:r>
-        <w:t>Ib</w:t>
-      </w:r>
-      <w:proofErr w:type="spellEnd"/>
-      <w:r>
-        <w:t xml:space="preserve"> – please also check whether this statement aligns with your new table</w:t>
+      <w:r>
+        <w:t>Anna</w:t>
+      </w:r>
+      <w:r>
+        <w:t>, are these still the same classes when using the new classifier?</w:t>
       </w:r>
     </w:p>
   </w:comment>
-  <w:comment w:id="3" w:author="Anna Marie Martyn" w:date="2026-01-05T20:46:00Z" w:initials="AMM">
+  <w:comment w:id="4" w:author="Anna Marie Martyn" w:date="2026-01-12T11:48:00Z" w:initials="AMM">
     <w:p>
       <w:pPr>
         <w:pStyle w:val="CommentText"/>
@@ -34305,27 +34272,11 @@
         <w:annotationRef/>
       </w:r>
       <w:r>
-        <w:t xml:space="preserve">@Ib – could you check this please? Regarding Lotus, </w:t>
-      </w:r>
-      <w:proofErr w:type="spellStart"/>
-      <w:r>
-        <w:t>Rhizobiales</w:t>
-      </w:r>
-      <w:proofErr w:type="spellEnd"/>
-      <w:r>
-        <w:t xml:space="preserve"> are included in the stacked bp (Fig.3D), but they weren’t listed in the supplementary </w:t>
-      </w:r>
-      <w:proofErr w:type="gramStart"/>
-      <w:r>
-        <w:t>table?;</w:t>
-      </w:r>
-      <w:proofErr w:type="gramEnd"/>
-      <w:r>
-        <w:t xml:space="preserve"> For Hordeum, the statements are still fairly correct, but need to be checked based on your table. I have the feeling the table I have from you might differ from the one I had when I wrote this section?</w:t>
+        <w:t>@ Simona, this suppl. figure is currently missing</w:t>
       </w:r>
     </w:p>
   </w:comment>
-  <w:comment w:id="5" w:author="Anna Marie Martyn" w:date="2026-01-05T21:30:00Z" w:initials="AMM">
+  <w:comment w:id="5" w:author="Anna Marie Martyn" w:date="2026-01-05T22:27:00Z" w:initials="AMM">
     <w:p>
       <w:pPr>
         <w:pStyle w:val="CommentText"/>
@@ -34337,82 +34288,6 @@
         <w:annotationRef/>
       </w:r>
       <w:r>
-        <w:t>Do we need an additional figure that shows the abundance of the nodule ASVs (detected earlier in WT suppl. Figure</w:t>
-      </w:r>
-      <w:r>
-        <w:t xml:space="preserve"> 1</w:t>
-      </w:r>
-      <w:r>
-        <w:t>) across WT and mutant root compartment, or is it sufficient to leave it as is?</w:t>
-      </w:r>
-    </w:p>
-  </w:comment>
-  <w:comment w:id="6" w:author="Anna Marie Martyn" w:date="2026-01-05T22:22:00Z" w:initials="AMM">
-    <w:p>
-      <w:pPr>
-        <w:pStyle w:val="CommentText"/>
-      </w:pPr>
-      <w:r>
-        <w:rPr>
-          <w:rStyle w:val="CommentReference"/>
-        </w:rPr>
-        <w:annotationRef/>
-      </w:r>
-      <w:r>
-        <w:t>@Ib – please check final numbers here</w:t>
-      </w:r>
-    </w:p>
-  </w:comment>
-  <w:comment w:id="7" w:author="Anna Marie Martyn" w:date="2026-01-05T23:40:00Z" w:initials="AMM">
-    <w:p>
-      <w:pPr>
-        <w:pStyle w:val="CommentText"/>
-      </w:pPr>
-      <w:r>
-        <w:rPr>
-          <w:rStyle w:val="CommentReference"/>
-        </w:rPr>
-        <w:annotationRef/>
-      </w:r>
-      <w:r>
-        <w:t xml:space="preserve">@ </w:t>
-      </w:r>
-      <w:r>
-        <w:t>Anna</w:t>
-      </w:r>
-      <w:r>
-        <w:t>, are these still the same classes when using the new classifier?</w:t>
-      </w:r>
-    </w:p>
-  </w:comment>
-  <w:comment w:id="8" w:author="Anna Marie Martyn" w:date="2026-01-12T11:48:00Z" w:initials="AMM">
-    <w:p>
-      <w:pPr>
-        <w:pStyle w:val="CommentText"/>
-      </w:pPr>
-      <w:r>
-        <w:rPr>
-          <w:rStyle w:val="CommentReference"/>
-        </w:rPr>
-        <w:annotationRef/>
-      </w:r>
-      <w:r>
-        <w:t>@ Simona, this suppl. figure is currently missing</w:t>
-      </w:r>
-    </w:p>
-  </w:comment>
-  <w:comment w:id="9" w:author="Anna Marie Martyn" w:date="2026-01-05T22:27:00Z" w:initials="AMM">
-    <w:p>
-      <w:pPr>
-        <w:pStyle w:val="CommentText"/>
-      </w:pPr>
-      <w:r>
-        <w:rPr>
-          <w:rStyle w:val="CommentReference"/>
-        </w:rPr>
-        <w:annotationRef/>
-      </w:r>
-      <w:r>
         <w:t xml:space="preserve">Necessary to show differences at pathway level? If so, @Ib could you double check that with the new analysis we still don’t have any significant differences at the pathway level for </w:t>
       </w:r>
       <w:proofErr w:type="gramStart"/>
@@ -34432,11 +34307,16 @@
       </w:r>
       <w:proofErr w:type="spellEnd"/>
       <w:r>
-        <w:t xml:space="preserve"> could you check the pathway names again with the new classifier that we used for panel C also?</w:t>
+        <w:t xml:space="preserve"> could you check the pathway names again with the new classifier that we used for panel C </w:t>
+      </w:r>
+      <w:proofErr w:type="gramStart"/>
+      <w:r>
+        <w:t>also?</w:t>
       </w:r>
       <w:r>
         <w:t>;</w:t>
       </w:r>
+      <w:proofErr w:type="gramEnd"/>
     </w:p>
     <w:p>
       <w:pPr>
@@ -34460,7 +34340,7 @@
       </w:r>
     </w:p>
   </w:comment>
-  <w:comment w:id="10" w:author="Anna Marie Martyn" w:date="2026-01-06T13:49:00Z" w:initials="AMM">
+  <w:comment w:id="6" w:author="Anna Marie Martyn" w:date="2026-01-06T13:49:00Z" w:initials="AMM">
     <w:p>
       <w:pPr>
         <w:pStyle w:val="CommentText"/>
@@ -34482,7 +34362,7 @@
       </w:r>
     </w:p>
   </w:comment>
-  <w:comment w:id="11" w:author="Anna Marie Martyn" w:date="2026-02-02T15:01:00Z" w:initials="AMM">
+  <w:comment w:id="7" w:author="Anna Marie Martyn" w:date="2026-02-02T15:01:00Z" w:initials="AMM">
     <w:p>
       <w:pPr>
         <w:pStyle w:val="CommentText"/>
@@ -34507,7 +34387,7 @@
       </w:r>
     </w:p>
   </w:comment>
-  <w:comment w:id="12" w:author="Anna Marie Martyn" w:date="2026-02-02T15:45:00Z" w:initials="AMM">
+  <w:comment w:id="8" w:author="Anna Marie Martyn" w:date="2026-02-02T15:45:00Z" w:initials="AMM">
     <w:p>
       <w:pPr>
         <w:pStyle w:val="CommentText"/>
@@ -34537,7 +34417,7 @@
       </w:r>
     </w:p>
   </w:comment>
-  <w:comment w:id="13" w:author="Unknown Author" w:date="2025-11-24T08:58:00Z" w:initials="">
+  <w:comment w:id="9" w:author="Unknown Author" w:date="2025-11-24T08:58:00Z" w:initials="">
     <w:p>
       <w:r>
         <w:rPr>
@@ -34582,7 +34462,7 @@
       </w:r>
     </w:p>
   </w:comment>
-  <w:comment w:id="14" w:author="Unknown Author" w:date="2025-11-24T08:37:00Z" w:initials="">
+  <w:comment w:id="10" w:author="Unknown Author" w:date="2025-11-24T08:37:00Z" w:initials="">
     <w:p>
       <w:r>
         <w:rPr>
@@ -34627,7 +34507,7 @@
       </w:r>
     </w:p>
   </w:comment>
-  <w:comment w:id="15" w:author="Anna Marie Martyn" w:date="2025-12-23T12:12:00Z" w:initials="AMM">
+  <w:comment w:id="11" w:author="Anna Marie Martyn" w:date="2025-12-23T12:12:00Z" w:initials="AMM">
     <w:p>
       <w:pPr>
         <w:pStyle w:val="CommentText"/>
@@ -34643,7 +34523,7 @@
       </w:r>
     </w:p>
   </w:comment>
-  <w:comment w:id="16" w:author="Anna Marie Martyn" w:date="2026-01-27T21:58:00Z" w:initials="AMM">
+  <w:comment w:id="12" w:author="Anna Marie Martyn" w:date="2026-01-27T21:58:00Z" w:initials="AMM">
     <w:p>
       <w:pPr>
         <w:pStyle w:val="CommentText"/>
@@ -34665,10 +34545,6 @@
 <file path=word/commentsExtended.xml><?xml version="1.0" encoding="utf-8"?>
 <w15:commentsEx xmlns:wpc="http://schemas.microsoft.com/office/word/2010/wordprocessingCanvas" xmlns:cx="http://schemas.microsoft.com/office/drawing/2014/chartex" xmlns:cx1="http://schemas.microsoft.com/office/drawing/2015/9/8/chartex" xmlns:cx2="http://schemas.microsoft.com/office/drawing/2015/10/21/chartex" xmlns:cx3="http://schemas.microsoft.com/office/drawing/2016/5/9/chartex" xmlns:cx4="http://schemas.microsoft.com/office/drawing/2016/5/10/chartex" xmlns:cx5="http://schemas.microsoft.com/office/drawing/2016/5/11/chartex" xmlns:cx6="http://schemas.microsoft.com/office/drawing/2016/5/12/chartex" xmlns:cx7="http://schemas.microsoft.com/office/drawing/2016/5/13/chartex" xmlns:cx8="http://schemas.microsoft.com/office/drawing/2016/5/14/chartex" xmlns:mc="http://schemas.openxmlformats.org/markup-compatibility/2006" xmlns:aink="http://schemas.microsoft.com/office/drawing/2016/ink" xmlns:am3d="http://schemas.microsoft.com/office/drawing/2017/model3d" xmlns:o="urn:schemas-microsoft-com:office:office" xmlns:oel="http://schemas.microsoft.com/office/2019/extlst" xmlns:r="http://schemas.openxmlformats.org/officeDocument/2006/relationships" xmlns:m="http://schemas.openxmlformats.org/officeDocument/2006/math" xmlns:v="urn:schemas-microsoft-com:vml" xmlns:wp14="http://schemas.microsoft.com/office/word/2010/wordprocessingDrawing" xmlns:wp="http://schemas.openxmlformats.org/drawingml/2006/wordprocessingDrawing" xmlns:w10="urn:schemas-microsoft-com:office:word" xmlns:w="http://schemas.openxmlformats.org/wordprocessingml/2006/main" xmlns:w14="http://schemas.microsoft.com/office/word/2010/wordml" xmlns:w15="http://schemas.microsoft.com/office/word/2012/wordml" xmlns:w16cex="http://schemas.microsoft.com/office/word/2018/wordml/cex" xmlns:w16cid="http://schemas.microsoft.com/office/word/2016/wordml/cid" xmlns:w16="http://schemas.microsoft.com/office/word/2018/wordml" xmlns:w16du="http://schemas.microsoft.com/office/word/2023/wordml/word16du" xmlns:w16sdtdh="http://schemas.microsoft.com/office/word/2020/wordml/sdtdatahash" xmlns:w16sdtfl="http://schemas.microsoft.com/office/word/2024/wordml/sdtformatlock" xmlns:w16se="http://schemas.microsoft.com/office/word/2015/wordml/symex" xmlns:wpg="http://schemas.microsoft.com/office/word/2010/wordprocessingGroup" xmlns:wpi="http://schemas.microsoft.com/office/word/2010/wordprocessingInk" xmlns:wne="http://schemas.microsoft.com/office/word/2006/wordml" xmlns:wps="http://schemas.microsoft.com/office/word/2010/wordprocessingShape" mc:Ignorable="w14 w15 w16se w16cid w16 w16cex w16sdtdh w16sdtfl w16du wp14">
   <w15:commentEx w15:paraId="3CC51EB1" w15:done="0"/>
-  <w15:commentEx w15:paraId="1F7C3410" w15:done="0"/>
-  <w15:commentEx w15:paraId="1A110570" w15:done="0"/>
-  <w15:commentEx w15:paraId="5D43FD8C" w15:done="0"/>
-  <w15:commentEx w15:paraId="00A8B632" w15:done="0"/>
   <w15:commentEx w15:paraId="1595EF62" w15:done="0"/>
   <w15:commentEx w15:paraId="46CE2669" w15:done="0"/>
   <w15:commentEx w15:paraId="738C1ACF" w15:done="0"/>
@@ -34687,10 +34563,6 @@
 <file path=word/commentsExtensible.xml><?xml version="1.0" encoding="utf-8"?>
 <w16cex:commentsExtensible xmlns:wpc="http://schemas.microsoft.com/office/word/2010/wordprocessingCanvas" xmlns:cx="http://schemas.microsoft.com/office/drawing/2014/chartex" xmlns:cx1="http://schemas.microsoft.com/office/drawing/2015/9/8/chartex" xmlns:cx2="http://schemas.microsoft.com/office/drawing/2015/10/21/chartex" xmlns:cx3="http://schemas.microsoft.com/office/drawing/2016/5/9/chartex" xmlns:cx4="http://schemas.microsoft.com/office/drawing/2016/5/10/chartex" xmlns:cx5="http://schemas.microsoft.com/office/drawing/2016/5/11/chartex" xmlns:cx6="http://schemas.microsoft.com/office/drawing/2016/5/12/chartex" xmlns:cx7="http://schemas.microsoft.com/office/drawing/2016/5/13/chartex" xmlns:cx8="http://schemas.microsoft.com/office/drawing/2016/5/14/chartex" xmlns:cr="http://schemas.microsoft.com/office/comments/2020/reactions" xmlns:mc="http://schemas.openxmlformats.org/markup-compatibility/2006" xmlns:aink="http://schemas.microsoft.com/office/drawing/2016/ink" xmlns:am3d="http://schemas.microsoft.com/office/drawing/2017/model3d" xmlns:o="urn:schemas-microsoft-com:office:office" xmlns:oel="http://schemas.microsoft.com/office/2019/extlst" xmlns:r="http://schemas.openxmlformats.org/officeDocument/2006/relationships" xmlns:m="http://schemas.openxmlformats.org/officeDocument/2006/math" xmlns:v="urn:schemas-microsoft-com:vml" xmlns:wp14="http://schemas.microsoft.com/office/word/2010/wordprocessingDrawing" xmlns:wp="http://schemas.openxmlformats.org/drawingml/2006/wordprocessingDrawing" xmlns:w10="urn:schemas-microsoft-com:office:word" xmlns:w="http://schemas.openxmlformats.org/wordprocessingml/2006/main" xmlns:w14="http://schemas.microsoft.com/office/word/2010/wordml" xmlns:w15="http://schemas.microsoft.com/office/word/2012/wordml" xmlns:w16cex="http://schemas.microsoft.com/office/word/2018/wordml/cex" xmlns:w16cid="http://schemas.microsoft.com/office/word/2016/wordml/cid" xmlns:w16="http://schemas.microsoft.com/office/word/2018/wordml" xmlns:w16du="http://schemas.microsoft.com/office/word/2023/wordml/word16du" xmlns:w16sdtdh="http://schemas.microsoft.com/office/word/2020/wordml/sdtdatahash" xmlns:w16sdtfl="http://schemas.microsoft.com/office/word/2024/wordml/sdtformatlock" xmlns:w16se="http://schemas.microsoft.com/office/word/2015/wordml/symex" xmlns:wpg="http://schemas.microsoft.com/office/word/2010/wordprocessingGroup" xmlns:wpi="http://schemas.microsoft.com/office/word/2010/wordprocessingInk" xmlns:wne="http://schemas.microsoft.com/office/word/2006/wordml" xmlns:wps="http://schemas.microsoft.com/office/word/2010/wordprocessingShape" mc:Ignorable="w14 w15 w16se w16cid w16 w16cex w16sdtdh w16sdtfl cr w16du wp14">
   <w16cex:commentExtensible w16cex:durableId="2379031D" w16cex:dateUtc="2026-01-27T21:02:00Z"/>
-  <w16cex:commentExtensible w16cex:durableId="19856E0D" w16cex:dateUtc="2026-02-03T08:35:00Z"/>
-  <w16cex:commentExtensible w16cex:durableId="5411E8EC" w16cex:dateUtc="2026-01-05T19:20:00Z"/>
-  <w16cex:commentExtensible w16cex:durableId="385D9957" w16cex:dateUtc="2026-01-05T19:50:00Z"/>
-  <w16cex:commentExtensible w16cex:durableId="5C9A1130" w16cex:dateUtc="2026-01-05T19:46:00Z"/>
   <w16cex:commentExtensible w16cex:durableId="677B4912" w16cex:dateUtc="2026-01-05T20:30:00Z"/>
   <w16cex:commentExtensible w16cex:durableId="7382F0E8" w16cex:dateUtc="2026-01-05T21:22:00Z"/>
   <w16cex:commentExtensible w16cex:durableId="4DD69407" w16cex:dateUtc="2026-01-05T22:40:00Z"/>
@@ -34707,10 +34579,6 @@
 <file path=word/commentsIds.xml><?xml version="1.0" encoding="utf-8"?>
 <w16cid:commentsIds xmlns:wpc="http://schemas.microsoft.com/office/word/2010/wordprocessingCanvas" xmlns:cx="http://schemas.microsoft.com/office/drawing/2014/chartex" xmlns:cx1="http://schemas.microsoft.com/office/drawing/2015/9/8/chartex" xmlns:cx2="http://schemas.microsoft.com/office/drawing/2015/10/21/chartex" xmlns:cx3="http://schemas.microsoft.com/office/drawing/2016/5/9/chartex" xmlns:cx4="http://schemas.microsoft.com/office/drawing/2016/5/10/chartex" xmlns:cx5="http://schemas.microsoft.com/office/drawing/2016/5/11/chartex" xmlns:cx6="http://schemas.microsoft.com/office/drawing/2016/5/12/chartex" xmlns:cx7="http://schemas.microsoft.com/office/drawing/2016/5/13/chartex" xmlns:cx8="http://schemas.microsoft.com/office/drawing/2016/5/14/chartex" xmlns:mc="http://schemas.openxmlformats.org/markup-compatibility/2006" xmlns:aink="http://schemas.microsoft.com/office/drawing/2016/ink" xmlns:am3d="http://schemas.microsoft.com/office/drawing/2017/model3d" xmlns:o="urn:schemas-microsoft-com:office:office" xmlns:oel="http://schemas.microsoft.com/office/2019/extlst" xmlns:r="http://schemas.openxmlformats.org/officeDocument/2006/relationships" xmlns:m="http://schemas.openxmlformats.org/officeDocument/2006/math" xmlns:v="urn:schemas-microsoft-com:vml" xmlns:wp14="http://schemas.microsoft.com/office/word/2010/wordprocessingDrawing" xmlns:wp="http://schemas.openxmlformats.org/drawingml/2006/wordprocessingDrawing" xmlns:w10="urn:schemas-microsoft-com:office:word" xmlns:w="http://schemas.openxmlformats.org/wordprocessingml/2006/main" xmlns:w14="http://schemas.microsoft.com/office/word/2010/wordml" xmlns:w15="http://schemas.microsoft.com/office/word/2012/wordml" xmlns:w16cex="http://schemas.microsoft.com/office/word/2018/wordml/cex" xmlns:w16cid="http://schemas.microsoft.com/office/word/2016/wordml/cid" xmlns:w16="http://schemas.microsoft.com/office/word/2018/wordml" xmlns:w16du="http://schemas.microsoft.com/office/word/2023/wordml/word16du" xmlns:w16sdtdh="http://schemas.microsoft.com/office/word/2020/wordml/sdtdatahash" xmlns:w16sdtfl="http://schemas.microsoft.com/office/word/2024/wordml/sdtformatlock" xmlns:w16se="http://schemas.microsoft.com/office/word/2015/wordml/symex" xmlns:wpg="http://schemas.microsoft.com/office/word/2010/wordprocessingGroup" xmlns:wpi="http://schemas.microsoft.com/office/word/2010/wordprocessingInk" xmlns:wne="http://schemas.microsoft.com/office/word/2006/wordml" xmlns:wps="http://schemas.microsoft.com/office/word/2010/wordprocessingShape" mc:Ignorable="w14 w15 w16se w16cid w16 w16cex w16sdtdh w16sdtfl w16du wp14">
   <w16cid:commentId w16cid:paraId="3CC51EB1" w16cid:durableId="2379031D"/>
-  <w16cid:commentId w16cid:paraId="1F7C3410" w16cid:durableId="19856E0D"/>
-  <w16cid:commentId w16cid:paraId="1A110570" w16cid:durableId="5411E8EC"/>
-  <w16cid:commentId w16cid:paraId="5D43FD8C" w16cid:durableId="385D9957"/>
-  <w16cid:commentId w16cid:paraId="00A8B632" w16cid:durableId="5C9A1130"/>
   <w16cid:commentId w16cid:paraId="1595EF62" w16cid:durableId="677B4912"/>
   <w16cid:commentId w16cid:paraId="46CE2669" w16cid:durableId="7382F0E8"/>
   <w16cid:commentId w16cid:paraId="738C1ACF" w16cid:durableId="4DD69407"/>

</xml_diff>